<commit_message>
Drop "Loại hình tuyển dụng" from CT-04
The approver is scoring the candidate, not recording which channel they
came through — that is already on CT-01.

Co-Authored-By: Claude Opus 5 <noreply@anthropic.com>
</commit_message>
<xml_diff>
--- a/public/templates/CT04_Phieu-danh-gia-phe-duyet-tuyen-dung_mau-trang.docx
+++ b/public/templates/CT04_Phieu-danh-gia-phe-duyet-tuyen-dung_mau-trang.docx
@@ -494,20 +494,6 @@
         </w:tc>
       </w:tr>
     </w:tbl>
-    <w:p>
-      <w:pPr>
-        <w:tabs>
-          <w:tab w:val="right" w:pos="9300" w:leader="dot"/>
-        </w:tabs>
-        <w:spacing w:after="200" w:line="240" w:lineRule="auto"/>
-      </w:pPr>
-      <w:r>
-        <w:t xml:space="preserve">Loại hình tuyển dụng: </w:t>
-      </w:r>
-      <w:r>
-        <w:t xml:space="preserve">	</w:t>
-      </w:r>
-    </w:p>
     <w:p>
       <w:pPr>
         <w:keepNext w:val="false"/>

</xml_diff>